<commit_message>
added chapter -1 ( 1.1 introduction and 1.2 Problem statement)
</commit_message>
<xml_diff>
--- a/src/documentation/final_report.docx
+++ b/src/documentation/final_report.docx
@@ -2,7 +2,344 @@
 <file path=word/document.xml><?xml version="1.0" encoding="utf-8"?>
 <w:document xmlns:wpc="http://schemas.microsoft.com/office/word/2010/wordprocessingCanvas" xmlns:cx="http://schemas.microsoft.com/office/drawing/2014/chartex" xmlns:cx1="http://schemas.microsoft.com/office/drawing/2015/9/8/chartex" xmlns:cx2="http://schemas.microsoft.com/office/drawing/2015/10/21/chartex" xmlns:cx3="http://schemas.microsoft.com/office/drawing/2016/5/9/chartex" xmlns:cx4="http://schemas.microsoft.com/office/drawing/2016/5/10/chartex" xmlns:cx5="http://schemas.microsoft.com/office/drawing/2016/5/11/chartex" xmlns:cx6="http://schemas.microsoft.com/office/drawing/2016/5/12/chartex" xmlns:cx7="http://schemas.microsoft.com/office/drawing/2016/5/13/chartex" xmlns:cx8="http://schemas.microsoft.com/office/drawing/2016/5/14/chartex" xmlns:mc="http://schemas.openxmlformats.org/markup-compatibility/2006" xmlns:aink="http://schemas.microsoft.com/office/drawing/2016/ink" xmlns:am3d="http://schemas.microsoft.com/office/drawing/2017/model3d" xmlns:o="urn:schemas-microsoft-com:office:office" xmlns:oel="http://schemas.microsoft.com/office/2019/extlst" xmlns:r="http://schemas.openxmlformats.org/officeDocument/2006/relationships" xmlns:m="http://schemas.openxmlformats.org/officeDocument/2006/math" xmlns:v="urn:schemas-microsoft-com:vml" xmlns:wp14="http://schemas.microsoft.com/office/word/2010/wordprocessingDrawing" xmlns:wp="http://schemas.openxmlformats.org/drawingml/2006/wordprocessingDrawing" xmlns:w10="urn:schemas-microsoft-com:office:word" xmlns:w="http://schemas.openxmlformats.org/wordprocessingml/2006/main" xmlns:w14="http://schemas.microsoft.com/office/word/2010/wordml" xmlns:w15="http://schemas.microsoft.com/office/word/2012/wordml" xmlns:w16cex="http://schemas.microsoft.com/office/word/2018/wordml/cex" xmlns:w16cid="http://schemas.microsoft.com/office/word/2016/wordml/cid" xmlns:w16="http://schemas.microsoft.com/office/word/2018/wordml" xmlns:w16du="http://schemas.microsoft.com/office/word/2023/wordml/word16du" xmlns:w16sdtdh="http://schemas.microsoft.com/office/word/2020/wordml/sdtdatahash" xmlns:w16se="http://schemas.microsoft.com/office/word/2015/wordml/symex" xmlns:wpg="http://schemas.microsoft.com/office/word/2010/wordprocessingGroup" xmlns:wpi="http://schemas.microsoft.com/office/word/2010/wordprocessingInk" xmlns:wne="http://schemas.microsoft.com/office/word/2006/wordml" xmlns:wps="http://schemas.microsoft.com/office/word/2010/wordprocessingShape" mc:Ignorable="w14 w15 w16se w16cid w16 w16cex w16sdtdh w16du wp14">
   <w:body>
-    <w:p/>
+    <w:p>
+      <w:pPr>
+        <w:pStyle w:val="Heading1"/>
+        <w:rPr>
+          <w:ins w:id="0" w:author="bishal tamang" w:date="2026-09-16T21:28:00Z" w16du:dateUtc="2026-09-16T15:43:00Z"/>
+        </w:rPr>
+        <w:pPrChange w:id="1" w:author="bishal tamang" w:date="2026-09-16T21:29:00Z" w16du:dateUtc="2026-09-16T15:44:00Z">
+          <w:pPr>
+            <w:jc w:val="both"/>
+          </w:pPr>
+        </w:pPrChange>
+      </w:pPr>
+      <w:ins w:id="2" w:author="bishal tamang" w:date="2026-09-16T21:17:00Z" w16du:dateUtc="2026-09-16T15:32:00Z">
+        <w:r>
+          <w:t xml:space="preserve">CHAPTER </w:t>
+        </w:r>
+        <w:proofErr w:type="gramStart"/>
+        <w:r>
+          <w:t>1 :</w:t>
+        </w:r>
+        <w:proofErr w:type="gramEnd"/>
+        <w:r>
+          <w:t xml:space="preserve"> Introduction</w:t>
+        </w:r>
+      </w:ins>
+    </w:p>
+    <w:p>
+      <w:pPr>
+        <w:pStyle w:val="Heading2"/>
+        <w:rPr>
+          <w:ins w:id="3" w:author="bishal tamang" w:date="2026-09-16T21:29:00Z" w16du:dateUtc="2026-09-16T15:44:00Z"/>
+        </w:rPr>
+        <w:pPrChange w:id="4" w:author="bishal tamang" w:date="2026-09-16T21:29:00Z" w16du:dateUtc="2026-09-16T15:44:00Z">
+          <w:pPr>
+            <w:jc w:val="both"/>
+          </w:pPr>
+        </w:pPrChange>
+      </w:pPr>
+      <w:ins w:id="5" w:author="bishal tamang" w:date="2026-09-16T21:29:00Z" w16du:dateUtc="2026-09-16T15:44:00Z">
+        <w:r>
+          <w:t xml:space="preserve">1.1 </w:t>
+        </w:r>
+      </w:ins>
+      <w:ins w:id="6" w:author="bishal tamang" w:date="2026-09-16T21:18:00Z" w16du:dateUtc="2026-09-16T15:33:00Z">
+        <w:r>
+          <w:t>Background</w:t>
+        </w:r>
+      </w:ins>
+    </w:p>
+    <w:p>
+      <w:pPr>
+        <w:jc w:val="both"/>
+        <w:rPr>
+          <w:ins w:id="7" w:author="bishal tamang" w:date="2026-09-16T21:28:00Z" w16du:dateUtc="2026-09-16T15:43:00Z"/>
+        </w:rPr>
+      </w:pPr>
+      <w:ins w:id="8" w:author="bishal tamang" w:date="2026-09-16T21:18:00Z" w16du:dateUtc="2026-09-16T15:33:00Z">
+        <w:r>
+          <w:t xml:space="preserve">As there </w:t>
+        </w:r>
+      </w:ins>
+      <w:ins w:id="9" w:author="bishal tamang" w:date="2026-09-16T21:19:00Z" w16du:dateUtc="2026-09-16T15:34:00Z">
+        <w:r>
+          <w:t xml:space="preserve">is </w:t>
+        </w:r>
+      </w:ins>
+      <w:ins w:id="10" w:author="bishal tamang" w:date="2026-09-16T21:18:00Z" w16du:dateUtc="2026-09-16T15:33:00Z">
+        <w:r>
+          <w:t xml:space="preserve">increase in use of modern websites </w:t>
+        </w:r>
+      </w:ins>
+      <w:ins w:id="11" w:author="bishal tamang" w:date="2026-09-16T21:19:00Z" w16du:dateUtc="2026-09-16T15:34:00Z">
+        <w:r>
+          <w:t xml:space="preserve">which are built using multiple and different technologies, techniques and structure. </w:t>
+        </w:r>
+      </w:ins>
+      <w:ins w:id="12" w:author="bishal tamang" w:date="2026-09-16T21:20:00Z" w16du:dateUtc="2026-09-16T15:35:00Z">
+        <w:r>
+          <w:t>For a developer or a designer already well build websites are the best for their study and improvement but for getting the information abo</w:t>
+        </w:r>
+      </w:ins>
+      <w:ins w:id="13" w:author="bishal tamang" w:date="2026-09-16T21:21:00Z" w16du:dateUtc="2026-09-16T15:36:00Z">
+        <w:r>
+          <w:t xml:space="preserve">ut it </w:t>
+        </w:r>
+        <w:proofErr w:type="spellStart"/>
+        <w:r>
+          <w:t>it</w:t>
+        </w:r>
+        <w:proofErr w:type="spellEnd"/>
+        <w:r>
+          <w:t xml:space="preserve"> might require some difficult or complex browsing tools which mostly affects the beginners who are willing to understand.</w:t>
+        </w:r>
+      </w:ins>
+      <w:ins w:id="14" w:author="bishal tamang" w:date="2026-09-16T21:22:00Z" w16du:dateUtc="2026-09-16T15:37:00Z">
+        <w:r>
+          <w:t xml:space="preserve"> The existing browser extension tools helps in different ways of the website analysis</w:t>
+        </w:r>
+      </w:ins>
+      <w:ins w:id="15" w:author="bishal tamang" w:date="2026-09-16T21:23:00Z" w16du:dateUtc="2026-09-16T15:38:00Z">
+        <w:r>
+          <w:t>, like some in technologies while some other focus on UI or graphical and other web features.</w:t>
+        </w:r>
+      </w:ins>
+    </w:p>
+    <w:p>
+      <w:pPr>
+        <w:jc w:val="both"/>
+        <w:rPr>
+          <w:ins w:id="16" w:author="bishal tamang" w:date="2026-09-16T21:29:00Z" w16du:dateUtc="2026-09-16T15:44:00Z"/>
+        </w:rPr>
+      </w:pPr>
+      <w:proofErr w:type="spellStart"/>
+      <w:ins w:id="17" w:author="bishal tamang" w:date="2026-09-16T21:23:00Z" w16du:dateUtc="2026-09-16T15:38:00Z">
+        <w:r>
+          <w:t>WebLens</w:t>
+        </w:r>
+        <w:proofErr w:type="spellEnd"/>
+        <w:r>
+          <w:t xml:space="preserve"> is a</w:t>
+        </w:r>
+      </w:ins>
+      <w:ins w:id="18" w:author="bishal tamang" w:date="2026-09-16T21:24:00Z" w16du:dateUtc="2026-09-16T15:39:00Z">
+        <w:r>
+          <w:t xml:space="preserve"> chrome extension which is designed to help or support in the simplest way possible to </w:t>
+        </w:r>
+        <w:proofErr w:type="spellStart"/>
+        <w:r>
+          <w:t>a</w:t>
+        </w:r>
+      </w:ins>
+      <w:ins w:id="19" w:author="bishal tamang" w:date="2026-09-16T21:32:00Z" w16du:dateUtc="2026-09-16T15:47:00Z">
+        <w:r>
+          <w:t>n</w:t>
+        </w:r>
+      </w:ins>
+      <w:ins w:id="20" w:author="bishal tamang" w:date="2026-09-16T21:24:00Z" w16du:dateUtc="2026-09-16T15:39:00Z">
+        <w:r>
+          <w:t>lay</w:t>
+        </w:r>
+      </w:ins>
+      <w:ins w:id="21" w:author="bishal tamang" w:date="2026-09-16T21:32:00Z" w16du:dateUtc="2026-09-16T15:47:00Z">
+        <w:r>
+          <w:t>s</w:t>
+        </w:r>
+      </w:ins>
+      <w:ins w:id="22" w:author="bishal tamang" w:date="2026-09-16T21:24:00Z" w16du:dateUtc="2026-09-16T15:39:00Z">
+        <w:r>
+          <w:t>e</w:t>
+        </w:r>
+        <w:proofErr w:type="spellEnd"/>
+        <w:r>
+          <w:t xml:space="preserve"> the website elements, without any complex process.</w:t>
+        </w:r>
+      </w:ins>
+      <w:ins w:id="23" w:author="bishal tamang" w:date="2026-09-16T21:26:00Z" w16du:dateUtc="2026-09-16T15:41:00Z">
+        <w:r>
+          <w:t xml:space="preserve"> </w:t>
+        </w:r>
+        <w:proofErr w:type="spellStart"/>
+        <w:r>
+          <w:t>WebLens</w:t>
+        </w:r>
+        <w:proofErr w:type="spellEnd"/>
+        <w:r>
+          <w:t xml:space="preserve"> first priority user comes for the beginner</w:t>
+        </w:r>
+      </w:ins>
+      <w:ins w:id="24" w:author="bishal tamang" w:date="2026-09-16T21:28:00Z" w16du:dateUtc="2026-09-16T15:43:00Z">
+        <w:r>
+          <w:t xml:space="preserve"> developer and students</w:t>
+        </w:r>
+      </w:ins>
+      <w:ins w:id="25" w:author="bishal tamang" w:date="2026-09-16T21:26:00Z" w16du:dateUtc="2026-09-16T15:41:00Z">
+        <w:r>
+          <w:t xml:space="preserve"> to help them understand more easily </w:t>
+        </w:r>
+        <w:r>
+          <w:t>and efficiently.</w:t>
+        </w:r>
+      </w:ins>
+      <w:ins w:id="26" w:author="bishal tamang" w:date="2026-09-16T21:27:00Z" w16du:dateUtc="2026-09-16T15:42:00Z">
+        <w:r>
+          <w:t xml:space="preserve"> This project also aims in providing real-time UI preview concept. </w:t>
+        </w:r>
+      </w:ins>
+    </w:p>
+    <w:p>
+      <w:pPr>
+        <w:pStyle w:val="Heading2"/>
+        <w:rPr>
+          <w:ins w:id="27" w:author="bishal tamang" w:date="2026-09-16T21:30:00Z" w16du:dateUtc="2026-09-16T15:45:00Z"/>
+        </w:rPr>
+        <w:pPrChange w:id="28" w:author="bishal tamang" w:date="2026-09-16T21:30:00Z" w16du:dateUtc="2026-09-16T15:45:00Z">
+          <w:pPr>
+            <w:jc w:val="both"/>
+          </w:pPr>
+        </w:pPrChange>
+      </w:pPr>
+      <w:ins w:id="29" w:author="bishal tamang" w:date="2026-09-16T21:29:00Z" w16du:dateUtc="2026-09-16T15:44:00Z">
+        <w:r>
+          <w:t>1.2 Problem Statem</w:t>
+        </w:r>
+      </w:ins>
+      <w:ins w:id="30" w:author="bishal tamang" w:date="2026-09-16T21:30:00Z" w16du:dateUtc="2026-09-16T15:45:00Z">
+        <w:r>
+          <w:t>ent</w:t>
+        </w:r>
+      </w:ins>
+    </w:p>
+    <w:p>
+      <w:pPr>
+        <w:jc w:val="both"/>
+        <w:rPr>
+          <w:ins w:id="31" w:author="bishal tamang" w:date="2026-09-16T21:35:00Z" w16du:dateUtc="2026-09-16T15:50:00Z"/>
+        </w:rPr>
+      </w:pPr>
+      <w:ins w:id="32" w:author="bishal tamang" w:date="2026-09-16T21:30:00Z" w16du:dateUtc="2026-09-16T15:45:00Z">
+        <w:r>
+          <w:t xml:space="preserve">The process of </w:t>
+        </w:r>
+      </w:ins>
+      <w:ins w:id="33" w:author="bishal tamang" w:date="2026-09-16T21:32:00Z" w16du:dateUtc="2026-09-16T15:47:00Z">
+        <w:r>
+          <w:t>analyzing</w:t>
+        </w:r>
+      </w:ins>
+      <w:ins w:id="34" w:author="bishal tamang" w:date="2026-09-16T21:30:00Z" w16du:dateUtc="2026-09-16T15:45:00Z">
+        <w:r>
+          <w:t xml:space="preserve"> a website includes multiple steps just to see the </w:t>
+        </w:r>
+      </w:ins>
+      <w:ins w:id="35" w:author="bishal tamang" w:date="2026-09-16T21:31:00Z" w16du:dateUtc="2026-09-16T15:46:00Z">
+        <w:r>
+          <w:t>information about an element. Getting exact what co</w:t>
+        </w:r>
+      </w:ins>
+      <w:ins w:id="36" w:author="bishal tamang" w:date="2026-09-16T21:32:00Z" w16du:dateUtc="2026-09-16T15:47:00Z">
+        <w:r>
+          <w:t>l</w:t>
+        </w:r>
+      </w:ins>
+      <w:ins w:id="37" w:author="bishal tamang" w:date="2026-09-16T21:31:00Z" w16du:dateUtc="2026-09-16T15:46:00Z">
+        <w:r>
+          <w:t>or is used, knowing about spacing and layout</w:t>
+        </w:r>
+      </w:ins>
+      <w:ins w:id="38" w:author="bishal tamang" w:date="2026-09-16T21:32:00Z" w16du:dateUtc="2026-09-16T15:47:00Z">
+        <w:r>
+          <w:t>, CSS properties</w:t>
+        </w:r>
+      </w:ins>
+      <w:ins w:id="39" w:author="bishal tamang" w:date="2026-09-16T21:31:00Z" w16du:dateUtc="2026-09-16T15:46:00Z">
+        <w:r>
+          <w:t xml:space="preserve"> and mostly which tech-stack has been used</w:t>
+        </w:r>
+      </w:ins>
+      <w:ins w:id="40" w:author="bishal tamang" w:date="2026-09-16T21:32:00Z" w16du:dateUtc="2026-09-16T15:47:00Z">
+        <w:r>
+          <w:t>.</w:t>
+        </w:r>
+      </w:ins>
+      <w:ins w:id="41" w:author="bishal tamang" w:date="2026-09-16T21:33:00Z" w16du:dateUtc="2026-09-16T15:48:00Z">
+        <w:r>
+          <w:t xml:space="preserve"> These problems are mostly faced by the students and beginner developer who wants to do research and learn from the existing websites. There are some e</w:t>
+        </w:r>
+      </w:ins>
+      <w:ins w:id="42" w:author="bishal tamang" w:date="2026-09-16T21:34:00Z" w16du:dateUtc="2026-09-16T15:49:00Z">
+        <w:r>
+          <w:t>xisting web</w:t>
+        </w:r>
+      </w:ins>
+      <w:ins w:id="43" w:author="bishal tamang" w:date="2026-09-16T21:37:00Z" w16du:dateUtc="2026-09-16T15:52:00Z">
+        <w:r>
+          <w:t>-</w:t>
+        </w:r>
+      </w:ins>
+      <w:ins w:id="44" w:author="bishal tamang" w:date="2026-09-16T21:34:00Z" w16du:dateUtc="2026-09-16T15:49:00Z">
+        <w:r>
+          <w:t>analyzing tools but many of them are quite complex for new user and many has the premium features to access it</w:t>
+        </w:r>
+      </w:ins>
+      <w:ins w:id="45" w:author="bishal tamang" w:date="2026-09-16T21:35:00Z" w16du:dateUtc="2026-09-16T15:50:00Z">
+        <w:r>
+          <w:t xml:space="preserve"> and also not all features are provided by the same application or the extension</w:t>
+        </w:r>
+      </w:ins>
+      <w:ins w:id="46" w:author="bishal tamang" w:date="2026-09-16T21:34:00Z" w16du:dateUtc="2026-09-16T15:49:00Z">
+        <w:r>
+          <w:t>.</w:t>
+        </w:r>
+      </w:ins>
+    </w:p>
+    <w:p>
+      <w:pPr>
+        <w:jc w:val="both"/>
+        <w:pPrChange w:id="47" w:author="bishal tamang" w:date="2026-09-16T21:28:00Z" w16du:dateUtc="2026-09-16T15:43:00Z">
+          <w:pPr/>
+        </w:pPrChange>
+      </w:pPr>
+      <w:ins w:id="48" w:author="bishal tamang" w:date="2026-09-16T21:35:00Z" w16du:dateUtc="2026-09-16T15:50:00Z">
+        <w:r>
+          <w:t xml:space="preserve">As a simple result there </w:t>
+        </w:r>
+      </w:ins>
+      <w:ins w:id="49" w:author="bishal tamang" w:date="2026-09-16T21:36:00Z" w16du:dateUtc="2026-09-16T15:51:00Z">
+        <w:r>
+          <w:t xml:space="preserve">is need of </w:t>
+        </w:r>
+        <w:proofErr w:type="gramStart"/>
+        <w:r>
+          <w:t>a</w:t>
+        </w:r>
+        <w:proofErr w:type="gramEnd"/>
+        <w:r>
+          <w:t xml:space="preserve"> analyzing tool that helps even the beginners to understand the information like technology and other element properties more easily with a proper user friendly environment and all at a same </w:t>
+        </w:r>
+      </w:ins>
+      <w:ins w:id="50" w:author="bishal tamang" w:date="2026-09-16T21:37:00Z" w16du:dateUtc="2026-09-16T15:52:00Z">
+        <w:r>
+          <w:t>platform</w:t>
+        </w:r>
+        <w:r>
+          <w:t>,</w:t>
+        </w:r>
+        <w:r>
+          <w:t xml:space="preserve"> which is the aim of </w:t>
+        </w:r>
+        <w:proofErr w:type="spellStart"/>
+        <w:r>
+          <w:t>WebLens</w:t>
+        </w:r>
+        <w:proofErr w:type="spellEnd"/>
+        <w:r>
+          <w:t>.</w:t>
+        </w:r>
+      </w:ins>
+    </w:p>
     <w:sectPr>
       <w:pgSz w:w="12240" w:h="15840"/>
       <w:pgMar w:top="1440" w:right="1440" w:bottom="1440" w:left="1440" w:header="720" w:footer="720" w:gutter="0"/>
@@ -11,6 +348,14 @@
     </w:sectPr>
   </w:body>
 </w:document>
+</file>
+
+<file path=word/people.xml><?xml version="1.0" encoding="utf-8"?>
+<w15:people xmlns:wpc="http://schemas.microsoft.com/office/word/2010/wordprocessingCanvas" xmlns:cx="http://schemas.microsoft.com/office/drawing/2014/chartex" xmlns:cx1="http://schemas.microsoft.com/office/drawing/2015/9/8/chartex" xmlns:cx2="http://schemas.microsoft.com/office/drawing/2015/10/21/chartex" xmlns:cx3="http://schemas.microsoft.com/office/drawing/2016/5/9/chartex" xmlns:cx4="http://schemas.microsoft.com/office/drawing/2016/5/10/chartex" xmlns:cx5="http://schemas.microsoft.com/office/drawing/2016/5/11/chartex" xmlns:cx6="http://schemas.microsoft.com/office/drawing/2016/5/12/chartex" xmlns:cx7="http://schemas.microsoft.com/office/drawing/2016/5/13/chartex" xmlns:cx8="http://schemas.microsoft.com/office/drawing/2016/5/14/chartex" xmlns:mc="http://schemas.openxmlformats.org/markup-compatibility/2006" xmlns:aink="http://schemas.microsoft.com/office/drawing/2016/ink" xmlns:am3d="http://schemas.microsoft.com/office/drawing/2017/model3d" xmlns:o="urn:schemas-microsoft-com:office:office" xmlns:oel="http://schemas.microsoft.com/office/2019/extlst" xmlns:r="http://schemas.openxmlformats.org/officeDocument/2006/relationships" xmlns:m="http://schemas.openxmlformats.org/officeDocument/2006/math" xmlns:v="urn:schemas-microsoft-com:vml" xmlns:wp14="http://schemas.microsoft.com/office/word/2010/wordprocessingDrawing" xmlns:wp="http://schemas.openxmlformats.org/drawingml/2006/wordprocessingDrawing" xmlns:w10="urn:schemas-microsoft-com:office:word" xmlns:w="http://schemas.openxmlformats.org/wordprocessingml/2006/main" xmlns:w14="http://schemas.microsoft.com/office/word/2010/wordml" xmlns:w15="http://schemas.microsoft.com/office/word/2012/wordml" xmlns:w16cex="http://schemas.microsoft.com/office/word/2018/wordml/cex" xmlns:w16cid="http://schemas.microsoft.com/office/word/2016/wordml/cid" xmlns:w16="http://schemas.microsoft.com/office/word/2018/wordml" xmlns:w16du="http://schemas.microsoft.com/office/word/2023/wordml/word16du" xmlns:w16sdtdh="http://schemas.microsoft.com/office/word/2020/wordml/sdtdatahash" xmlns:w16se="http://schemas.microsoft.com/office/word/2015/wordml/symex" xmlns:wpg="http://schemas.microsoft.com/office/word/2010/wordprocessingGroup" xmlns:wpi="http://schemas.microsoft.com/office/word/2010/wordprocessingInk" xmlns:wne="http://schemas.microsoft.com/office/word/2006/wordml" xmlns:wps="http://schemas.microsoft.com/office/word/2010/wordprocessingShape" mc:Ignorable="w14 w15 w16se w16cid w16 w16cex w16sdtdh w16du wp14">
+  <w15:person w15:author="bishal tamang">
+    <w15:presenceInfo w15:providerId="Windows Live" w15:userId="2f9ff840b0136e85"/>
+  </w15:person>
+</w15:people>
 </file>
 
 <file path=word/styles.xml><?xml version="1.0" encoding="utf-8"?>
@@ -441,7 +786,6 @@
     <w:next w:val="Normal"/>
     <w:link w:val="Heading2Char"/>
     <w:uiPriority w:val="9"/>
-    <w:semiHidden/>
     <w:unhideWhenUsed/>
     <w:qFormat/>
     <w:rsid w:val="00264A26"/>
@@ -658,7 +1002,6 @@
     <w:basedOn w:val="DefaultParagraphFont"/>
     <w:link w:val="Heading2"/>
     <w:uiPriority w:val="9"/>
-    <w:semiHidden/>
     <w:rsid w:val="00264A26"/>
     <w:rPr>
       <w:rFonts w:asciiTheme="majorHAnsi" w:eastAsiaTheme="majorEastAsia" w:hAnsiTheme="majorHAnsi" w:cstheme="majorBidi"/>
@@ -929,6 +1272,16 @@
       <w:color w:val="0F4761" w:themeColor="accent1" w:themeShade="BF"/>
       <w:spacing w:val="5"/>
     </w:rPr>
+  </w:style>
+  <w:style w:type="paragraph" w:styleId="Revision">
+    <w:name w:val="Revision"/>
+    <w:hidden/>
+    <w:uiPriority w:val="99"/>
+    <w:semiHidden/>
+    <w:rsid w:val="006161D4"/>
+    <w:pPr>
+      <w:spacing w:after="0" w:line="240" w:lineRule="auto"/>
+    </w:pPr>
   </w:style>
 </w:styles>
 </file>

</xml_diff>